<commit_message>
Added more court and data variation for testing
</commit_message>
<xml_diff>
--- a/docs/Chunk Structure and Retrieval Architecture.docx
+++ b/docs/Chunk Structure and Retrieval Architecture.docx
@@ -6262,19 +6262,19 @@
               <w:jc w:val="left"/>
             </w:pPr>
             <w:r>
-              <w:t xml:space="preserve">50 of 200 records have no recoverable decision date</w:t>
-            </w:r>
-          </w:p>
-        </w:tc>
-        <w:tc>
-          <w:tcPr/>
-          <w:p>
-            <w:pPr>
-              <w:pStyle w:val="Compact"/>
-              <w:jc w:val="left"/>
-            </w:pPr>
-            <w:r>
-              <w:t xml:space="preserve">Either accept null + flag, or add a second extraction path from the ruling body.</w:t>
+              <w:t>Largely CLOSED. Widening the ruling-sentence pattern to accept 'gununde' and dot separators took danistay from 150/200 to 199/200. One record still has no recoverable date and is flagged.</w:t>
+            </w:r>
+          </w:p>
+        </w:tc>
+        <w:tc>
+          <w:tcPr/>
+          <w:p>
+            <w:pPr>
+              <w:pStyle w:val="Compact"/>
+              <w:jc w:val="left"/>
+            </w:pPr>
+            <w:r>
+              <w:t>Accept the single null + flag, or inspect that one record.</w:t>
             </w:r>
           </w:p>
         </w:tc>
@@ -6373,58 +6373,31 @@
               <w:jc w:val="left"/>
             </w:pPr>
             <w:r>
-              <w:t xml:space="preserve">3 blocked sources</w:t>
-            </w:r>
-          </w:p>
-        </w:tc>
-        <w:tc>
-          <w:tcPr/>
-          <w:p>
-            <w:pPr>
-              <w:pStyle w:val="Compact"/>
-              <w:jc w:val="left"/>
-            </w:pPr>
-            <w:r>
-              <w:t xml:space="preserve">Re-verified Sept 2026, unchanged: rekabet 200/200 empty (</w:t>
-            </w:r>
-            <w:r>
-              <w:rPr>
-                <w:rStyle w:val="VerbatimChar"/>
-              </w:rPr>
-              <w:t xml:space="preserve">pending_extraction</w:t>
-            </w:r>
-            <w:r>
-              <w:t xml:space="preserve">), uyusmazlik 300/300 empty (</w:t>
-            </w:r>
-            <w:r>
-              <w:rPr>
-                <w:rStyle w:val="VerbatimChar"/>
-              </w:rPr>
-              <w:t xml:space="preserve">pending_extraction</w:t>
-            </w:r>
-            <w:r>
-              <w:t xml:space="preserve">), yargitay 297/300 empty (</w:t>
-            </w:r>
-            <w:r>
-              <w:rPr>
-                <w:rStyle w:val="VerbatimChar"/>
-              </w:rPr>
-              <w:t xml:space="preserve">pending_fetch</w:t>
-            </w:r>
-            <w:r>
-              <w:t xml:space="preserve">). Upstream data-pipeline issue, not a chunking problem.</w:t>
-            </w:r>
-          </w:p>
-        </w:tc>
-        <w:tc>
-          <w:tcPr/>
-          <w:p>
-            <w:pPr>
-              <w:pStyle w:val="Compact"/>
-              <w:jc w:val="left"/>
-            </w:pPr>
-            <w:r>
-              <w:t xml:space="preserve">Deferred by decision. Re-check status periodically; apply the same pipeline once unblocked.</w:t>
+              <w:t>2 blocked sources (was 3)</w:t>
+            </w:r>
+          </w:p>
+        </w:tc>
+        <w:tc>
+          <w:tcPr/>
+          <w:p>
+            <w:pPr>
+              <w:pStyle w:val="Compact"/>
+              <w:jc w:val="left"/>
+            </w:pPr>
+            <w:r>
+              <w:t>Re-verified Sept 2026 against the DATABASE, not a sample: all 10,367 rekabet rows are status=pending_extraction and a `content_text &lt;&gt; ''` filter returns zero rows. uyusmazlik looks the same on disk (350/350 empty). A second export of 50 rows per source added 50 new decisions each — rekabet 250, uyusmazlik 350 — and not one carries text; the bodies are PDFs at metadata.data.pdf_url. YARGITAY IS NO LONGER BLOCKED — a SQL export supplied 45 usable decisions, merged to 345 records / 48 with text, chunked and verified. The database holds 7,617,378 completed yargitay records, so what we have is 0.0006% of what exists.</w:t>
+            </w:r>
+          </w:p>
+        </w:tc>
+        <w:tc>
+          <w:tcPr/>
+          <w:p>
+            <w:pPr>
+              <w:pStyle w:val="Compact"/>
+              <w:jc w:val="left"/>
+            </w:pPr>
+            <w:r>
+              <w:t>Both are now REGISTERED as sources 7 and 8: every metadata-derived field (case_no, decision_date, subject_type) is wired and tested against all 600 rows, while text_field, the paragraph strategy and the role values are left null until a real body is seen. The blocker is PDF extraction upstream, not chunking. For yargitay the next step is a larger targeted pull.</w:t>
             </w:r>
           </w:p>
         </w:tc>
@@ -6671,37 +6644,7 @@
         <w:pStyle w:val="FirstParagraph"/>
       </w:pPr>
       <w:r>
-        <w:t xml:space="preserve">Seven additional data sources exist beyond AYM: bam, danistay, first_degree, kvkk, rekabet, uyusmazlik, and yargitay. Three of these (rekabet, uyusmazlik, yargitay) have no real content available yet in the current data snapshot; each is marked</w:t>
-      </w:r>
-      <w:r>
-        <w:t xml:space="preserve"> </w:t>
-      </w:r>
-      <w:r>
-        <w:rPr>
-          <w:rStyle w:val="VerbatimChar"/>
-        </w:rPr>
-        <w:t xml:space="preserve">pending_extraction</w:t>
-      </w:r>
-      <w:r>
-        <w:t xml:space="preserve"> </w:t>
-      </w:r>
-      <w:r>
-        <w:t xml:space="preserve">or</w:t>
-      </w:r>
-      <w:r>
-        <w:t xml:space="preserve"> </w:t>
-      </w:r>
-      <w:r>
-        <w:rPr>
-          <w:rStyle w:val="VerbatimChar"/>
-        </w:rPr>
-        <w:t xml:space="preserve">pending_fetch</w:t>
-      </w:r>
-      <w:r>
-        <w:t xml:space="preserve"> </w:t>
-      </w:r>
-      <w:r>
-        <w:t xml:space="preserve">at the source. That is a data-pipeline issue, not a chunking design issue, and is out of scope for this document.</w:t>
+        <w:t>Seven additional data sources exist beyond AYM: bam, danistay, first_degree, kvkk, rekabet, uyusmazlik, and yargitay. Two of these (rekabet, uyusmazlik) still have no real content: every row is marked pending_extraction at the source and the decision bodies exist only as PDFs. Both are nevertheless registered as sources 7 and 8, with everything derivable from metadata wired and verified and everything requiring text deliberately left null — so the day extraction runs, three decisions remain (paragraph strategy, role values, prompt) rather than a fresh integration. Yargitay was in that group until September 2026, when a SQL export supplied 45 usable decisions — see 15.9. That is a data-pipeline matter, not a chunking design issue, and is out of scope for this document.</w:t>
       </w:r>
     </w:p>
     <w:p>
@@ -12308,19 +12251,7 @@
               <w:jc w:val="left"/>
             </w:pPr>
             <w:r>
-              <w:t xml:space="preserve">Code, ISO format. aym and kvkk from</w:t>
-            </w:r>
-            <w:r>
-              <w:t xml:space="preserve"> </w:t>
-            </w:r>
-            <w:r>
-              <w:rPr>
-                <w:rStyle w:val="VerbatimChar"/>
-              </w:rPr>
-              <w:t xml:space="preserve">metadata.data</w:t>
-            </w:r>
-            <w:r>
-              <w:t xml:space="preserve">; bam and first_degree from metadata in DD.MM.YYYY; danistay from the ruling sentence itself — 150/200 coverage, the remaining 50 left null and flagged.</w:t>
+              <w:t>Code, ISO format. aym and kvkk from metadata.data; bam and first_degree from metadata in DD.MM.YYYY; yargitay from metadata.karar_tarihi where present, else the ruling sentence. The ruling-sentence pattern accepts BOTH separators (. and /) and BOTH adverbs (tarihinde, gununde) — chambers differ, and the earlier tarihinde-and-slash-only pattern matched just 15 of 45 yargitay documents. Widening it took yargitay to 48/48 and danistay from 150/200 to 199/200, closing a gap this document previously listed as known. Corpus-wide: 1,035 of 1,037.</w:t>
             </w:r>
           </w:p>
         </w:tc>
@@ -16142,22 +16073,7 @@
               <w:jc w:val="left"/>
             </w:pPr>
             <w:r>
-              <w:t xml:space="preserve">Dedupe, plus a per-segment citation cap;</w:t>
-            </w:r>
-            <w:r>
-              <w:t xml:space="preserve"> </w:t>
-            </w:r>
-            <w:r>
-              <w:rPr>
-                <w:rStyle w:val="VerbatimChar"/>
-              </w:rPr>
-              <w:t xml:space="preserve">finish_reason</w:t>
-            </w:r>
-            <w:r>
-              <w:t xml:space="preserve"> </w:t>
-            </w:r>
-            <w:r>
-              <w:t xml:space="preserve">is now captured and checked.</w:t>
+              <w:t>Identical citations deduped in code, and the prompt caps each provision at once per segment. finish_reason is now captured, so truncation is reported as truncation rather than as a JSON parse error.</w:t>
             </w:r>
           </w:p>
         </w:tc>
@@ -16446,7 +16362,235 @@
               <w:jc w:val="left"/>
             </w:pPr>
             <w:r>
-              <w:t xml:space="preserve">Prompt version recorded with every run; a prompt edit is treated as a re-segmentation event, not a patch.</w:t>
+              <w:t>Accepted as a property, not fixed: output is byte-identical for an unchanged prompt, and any prompt edit is treated as a re-segmentation event. Prompt-version recording is NOT implemented.</w:t>
+            </w:r>
+          </w:p>
+        </w:tc>
+      </w:tr>
+      <w:tr>
+        <w:tc>
+          <w:tcPr/>
+          <w:p>
+            <w:pPr>
+              <w:pStyle w:val="Compact"/>
+              <w:jc w:val="left"/>
+            </w:pPr>
+            <w:r>
+              <w:t>Status vocabulary mismatch</w:t>
+            </w:r>
+          </w:p>
+        </w:tc>
+        <w:tc>
+          <w:tcPr/>
+          <w:p>
+            <w:pPr>
+              <w:pStyle w:val="Compact"/>
+              <w:jc w:val="left"/>
+            </w:pPr>
+            <w:r>
+              <w:t>The scraper writes status 'fetched'; the SQL export writes 'completed'. The filter accepted only 'fetched', so all 45 exported yargitay rows were skipped — zero documents, no error, no clue why.</w:t>
+            </w:r>
+          </w:p>
+        </w:tc>
+        <w:tc>
+          <w:tcPr/>
+          <w:p>
+            <w:pPr>
+              <w:pStyle w:val="Compact"/>
+              <w:jc w:val="left"/>
+            </w:pPr>
+            <w:r>
+              <w:t>Accept both. A silent skip is worse than a crash: nothing in the output says a source was dropped.</w:t>
+            </w:r>
+          </w:p>
+        </w:tc>
+      </w:tr>
+      <w:tr>
+        <w:tc>
+          <w:tcPr/>
+          <w:p>
+            <w:pPr>
+              <w:pStyle w:val="Compact"/>
+              <w:jc w:val="left"/>
+            </w:pPr>
+            <w:r>
+              <w:t>Silent null from a date parse</w:t>
+            </w:r>
+          </w:p>
+        </w:tc>
+        <w:tc>
+          <w:tcPr/>
+          <w:p>
+            <w:pPr>
+              <w:pStyle w:val="Compact"/>
+              <w:jc w:val="left"/>
+            </w:pPr>
+            <w:r>
+              <w:t>Widening the ruling-date pattern to accept dot separators made it match text the ISO converter could not parse (it split on '/' only). The converter returned None and the loop returned that as the date — no value AND no flag.</w:t>
+            </w:r>
+          </w:p>
+        </w:tc>
+        <w:tc>
+          <w:tcPr/>
+          <w:p>
+            <w:pPr>
+              <w:pStyle w:val="Compact"/>
+              <w:jc w:val="left"/>
+            </w:pPr>
+            <w:r>
+              <w:t>Normalise the separator before converting, and keep scanning on a failed parse instead of giving up on the first match.</w:t>
+            </w:r>
+          </w:p>
+        </w:tc>
+      </w:tr>
+      <w:tr>
+        <w:tc>
+          <w:tcPr/>
+          <w:p>
+            <w:pPr>
+              <w:pStyle w:val="Compact"/>
+              <w:jc w:val="left"/>
+            </w:pPr>
+            <w:r>
+              <w:t>Long documents exceed the output budget</w:t>
+            </w:r>
+          </w:p>
+        </w:tc>
+        <w:tc>
+          <w:tcPr/>
+          <w:p>
+            <w:pPr>
+              <w:pStyle w:val="Compact"/>
+              <w:jc w:val="left"/>
+            </w:pPr>
+            <w:r>
+              <w:t>aym 0ddd6b3c (184,377 chars, 559 paragraphs) failed with max_output_tokens_truncated on both attempts, each stopping exactly at the 32,768 cap — half the model's 65,536 budget was unused.</w:t>
+            </w:r>
+          </w:p>
+        </w:tc>
+        <w:tc>
+          <w:tcPr/>
+          <w:p>
+            <w:pPr>
+              <w:pStyle w:val="Compact"/>
+              <w:jc w:val="left"/>
+            </w:pPr>
+            <w:r>
+              <w:t>Cap raised to 65,536, plus a pre-flight size estimate that refuses an over-budget document up front instead of paying twice to discover it. 1 of 1,037 corpus documents is refused; 29 sit in the at-risk band.</w:t>
+            </w:r>
+          </w:p>
+        </w:tc>
+      </w:tr>
+      <w:tr>
+        <w:tc>
+          <w:tcPr/>
+          <w:p>
+            <w:pPr>
+              <w:pStyle w:val="Compact"/>
+              <w:jc w:val="left"/>
+            </w:pPr>
+            <w:r>
+              <w:t>An export that looked valid and carried no text</w:t>
+            </w:r>
+          </w:p>
+        </w:tc>
+        <w:tc>
+          <w:tcPr/>
+          <w:p>
+            <w:pPr>
+              <w:pStyle w:val="Compact"/>
+              <w:jc w:val="left"/>
+            </w:pPr>
+            <w:r>
+              <w:t>Two SQL exports (rekabet, uyusmazlik) returned 50 well-formed rows each, full 26-column schema, complete metadata — and content_text empty on every one. The query omitted the status filter the yargitay export had, so it drew pending_extraction rows. Checking the database showed the problem was not the query: all 10,367 rekabet rows are unextracted.</w:t>
+            </w:r>
+          </w:p>
+        </w:tc>
+        <w:tc>
+          <w:tcPr/>
+          <w:p>
+            <w:pPr>
+              <w:pStyle w:val="Compact"/>
+              <w:jc w:val="left"/>
+            </w:pPr>
+            <w:r>
+              <w:t>Row counts are now reported as 'N of M have text', never as 'M rows'. convert_export.py prints the text count on every conversion and says so explicitly when it is zero.</w:t>
+            </w:r>
+          </w:p>
+        </w:tc>
+      </w:tr>
+      <w:tr>
+        <w:tc>
+          <w:tcPr/>
+          <w:p>
+            <w:pPr>
+              <w:pStyle w:val="Compact"/>
+              <w:jc w:val="left"/>
+            </w:pPr>
+            <w:r>
+              <w:t>content_text is "", not NULL</w:t>
+            </w:r>
+          </w:p>
+        </w:tc>
+        <w:tc>
+          <w:tcPr/>
+          <w:p>
+            <w:pPr>
+              <w:pStyle w:val="Compact"/>
+              <w:jc w:val="left"/>
+            </w:pPr>
+            <w:r>
+              <w:t>The obvious repair — filtering the export on `content_text is not null` — returns every empty row unchanged, because the column holds an empty string rather than NULL. A second export would have looked like a fix and changed nothing.</w:t>
+            </w:r>
+          </w:p>
+        </w:tc>
+        <w:tc>
+          <w:tcPr/>
+          <w:p>
+            <w:pPr>
+              <w:pStyle w:val="Compact"/>
+              <w:jc w:val="left"/>
+            </w:pPr>
+            <w:r>
+              <w:t>Filter on `content_text &lt;&gt; ''`. data/ keeps the raw "" so it stays a faithful copy of the database; the distinction is handled in the pipeline, where text_field=None marks a source whose text column is not yet known.</w:t>
+            </w:r>
+          </w:p>
+        </w:tc>
+      </w:tr>
+      <w:tr>
+        <w:tc>
+          <w:tcPr/>
+          <w:p>
+            <w:pPr>
+              <w:pStyle w:val="Compact"/>
+              <w:jc w:val="left"/>
+            </w:pPr>
+            <w:r>
+              <w:t>A registered source with no data skipping in silence</w:t>
+            </w:r>
+          </w:p>
+        </w:tc>
+        <w:tc>
+          <w:tcPr/>
+          <w:p>
+            <w:pPr>
+              <w:pStyle w:val="Compact"/>
+              <w:jc w:val="left"/>
+            </w:pPr>
+            <w:r>
+              <w:t>Once rekabet was registered, pick_documents returned zero documents and the run printed an ordinary skip line. This is the same shape as the status='completed' mismatch that hid 45 yargitay documents for a whole round: no error, no clue.</w:t>
+            </w:r>
+          </w:p>
+        </w:tc>
+        <w:tc>
+          <w:tcPr/>
+          <w:p>
+            <w:pPr>
+              <w:pStyle w:val="Compact"/>
+              <w:jc w:val="left"/>
+            </w:pPr>
+            <w:r>
+              <w:t>run() refuses any source in TEXT_PENDING_SOURCES with an explicit BLOCKED block naming the row count, the upstream state and the reason, before any Gemini call is built. extract_paragraphs raises a named NotImplementedError instead of a bare KeyError.</w:t>
             </w:r>
           </w:p>
         </w:tc>
@@ -16459,6 +16603,65 @@
     </w:p>
     <w:p>
       <w:pPr>
+        <w:pStyle w:val="Heading2"/>
+      </w:pPr>
+      <w:r>
+        <w:t>15.9 Structural heterogeneity: when one archetype per source stops working</w:t>
+      </w:r>
+    </w:p>
+    <w:p>
+      <w:pPr>
+        <w:pStyle w:val="BodyText"/>
+      </w:pPr>
+      <w:r>
+        <w:t>Every source before yargitay had ONE document layout, and the per-source prompt note described it by listing that layout's section markers. Yargitay broke that assumption, and it is worth recording because the next court is likely to break it too.</w:t>
+      </w:r>
+    </w:p>
+    <w:p>
+      <w:pPr>
+        <w:pStyle w:val="BodyText"/>
+      </w:pPr>
+      <w:r>
+        <w:t>Yargitay has roughly 46 chambers. Across the 48 documents we hold, at least four layouts appear: a Roman-numeral series (I. DAVA ... VI. KARAR, 3 documents); a criminal form with SUC : and HUKUM : labels (13); a civil form with DAVA TURU : (8); and — the most common at 23 of 45 — no section labels at all, just a letter-spaced heading such as 'Y A R G I T A Y  K A R A R I' and a SONUC: at the end. Chambers differ even on capitalisation: 3./8./11./14./15./18. Ceza write SUC :, while 10./12./16. Ceza write Suc :. A case-sensitive match finds 13 of 45 and silently loses 8.</w:t>
+      </w:r>
+    </w:p>
+    <w:p>
+      <w:pPr>
+        <w:pStyle w:val="BodyText"/>
+      </w:pPr>
+      <w:r>
+        <w:t>Listing markers for 46 chambers is a losing game: the set is large, inconsistent, and the next export will contain layouts these 48 do not. So the yargitay source note was rewritten around FUNCTION instead — what does this paragraph DO (recount the courts below, state the appellant's argument, reason, dispose) — with confidence: low expected often and the `other` role absorbing header blocks and file-routing directives. This is precisely the case section 15 argues the LLM pipeline exists for: marker matching is what the regex pipeline already does, and already fails at.</w:t>
+      </w:r>
+    </w:p>
+    <w:p>
+      <w:pPr>
+        <w:pStyle w:val="BodyText"/>
+      </w:pPr>
+      <w:r>
+        <w:t>Two consequences for the schema. subject_type became per-document for the first time: yargitay spans criminal and civil chambers (29 of 45 export rows are Ceza), so a fixed per-source constant is wrong for whichever half it does not describe. It resolves from chamber_id — below 23 is Hukuk, 23 and above is Ceza — to criminal_offence or civil_or_administrative_case. criminal_offence rather than criminal_case because subject_type declares what subject_id IS: for a criminal cassation the subject is the offence, so subject_id 'dolandiricilik' answers 'every fraud cassation decision', whereas criminal_case would merely restate source_type.</w:t>
+      </w:r>
+    </w:p>
+    <w:p>
+      <w:pPr>
+        <w:pStyle w:val="BodyText"/>
+      </w:pPr>
+      <w:r>
+        <w:t>And 27% of yargitay decisions (12 of 45) carry MORE THAN ONE disposition — DUZELTILEREK + ONANMASINA, or BOZULMASINA + DUZELTILEREK + ONANMASINA. The single-string outcome field is lossy there. In practice the model handled it well by emitting one capsule per disposition (document 558301300 produced an onama capsule for the forgery count and a bozma capsule for the fraud count), but the schema does not require that, and it should be decided deliberately rather than left to the model.</w:t>
+      </w:r>
+    </w:p>
+    <w:p>
+      <w:pPr>
+        <w:pStyle w:val="BodyText"/>
+      </w:pPr>
+      <w:r>
+        <w:t>What yargitay still does not test: dissent. All 345 records we hold are unanimous — the four dissent markers appear 0 times and OYCOKLUGU 0 times, while oybirligi appears in 46. A database query confirmed dissent DOES exist in the wider corpus, so this is a sampling gap, not a property of the court. The dissent role itself is exercised elsewhere: the current output carries 5 dissent chunks and two dissent capsules from aym and danistay.</w:t>
+      </w:r>
+    </w:p>
+    <w:p>
+      <w:pPr/>
+    </w:p>
+    <w:p>
+      <w:pPr>
         <w:pStyle w:val="BodyText"/>
       </w:pPr>
       <w:r>
@@ -16466,7 +16669,7 @@
           <w:iCs/>
           <w:i/>
         </w:rPr>
-        <w:t xml:space="preserve">Version: September 2026 — section 15 rewritten from plan to built: single-call design (two-pass rejected), full field-ownership tables for chunks/citations/capsules finalized,</w:t>
+        <w:t>Version: September 2026 — section 15 rewritten from plan to built: single-call design (two-pass rejected), full field-ownership tables for chunks/citations/capsules finalized, chunk_id a deterministic UUID from the start, pilot findings in 15.8, and 15.9 added after yargitay became the first structurally heterogeneous source. Implementation dates: 11–14 September 2026.</w:t>
       </w:r>
       <w:r>
         <w:rPr>

</xml_diff>